<commit_message>
Fixed crediting on main report
</commit_message>
<xml_diff>
--- a/Report/Stack_Assignment_Report_Chris-Brilianto-Chandra_2086022510022.docx
+++ b/Report/Stack_Assignment_Report_Chris-Brilianto-Chandra_2086022510022.docx
@@ -5747,7 +5747,23 @@
           <w:sz w:val="20"/>
           <w:szCs w:val="20"/>
         </w:rPr>
-        <w:t xml:space="preserve"> dia </w:t>
+        <w:t xml:space="preserve"> </w:t>
+      </w:r>
+      <w:proofErr w:type="spellStart"/>
+      <w:r>
+        <w:rPr>
+          <w:sz w:val="20"/>
+          <w:szCs w:val="20"/>
+        </w:rPr>
+        <w:t>dia</w:t>
+      </w:r>
+      <w:proofErr w:type="spellEnd"/>
+      <w:r>
+        <w:rPr>
+          <w:sz w:val="20"/>
+          <w:szCs w:val="20"/>
+        </w:rPr>
+        <w:t xml:space="preserve"> </w:t>
       </w:r>
       <w:proofErr w:type="spellStart"/>
       <w:r>
@@ -6022,14 +6038,7 @@
           <w:sz w:val="20"/>
           <w:szCs w:val="20"/>
         </w:rPr>
-        <w:t xml:space="preserve"> </w:t>
-      </w:r>
-      <w:r>
-        <w:rPr>
-          <w:sz w:val="20"/>
-          <w:szCs w:val="20"/>
-        </w:rPr>
-        <w:t>Balanced</w:t>
+        <w:t xml:space="preserve"> Balanced</w:t>
       </w:r>
     </w:p>
     <w:p/>
@@ -6112,31 +6121,91 @@
     </w:p>
     <w:p>
       <w:pPr>
+        <w:pStyle w:val="ListParagraph"/>
+        <w:numPr>
+          <w:ilvl w:val="0"/>
+          <w:numId w:val="41"/>
+        </w:numPr>
         <w:jc w:val="both"/>
         <w:rPr>
           <w:sz w:val="20"/>
           <w:szCs w:val="20"/>
         </w:rPr>
       </w:pPr>
-      <w:hyperlink r:id="rId11" w:history="1">
-        <w:r>
-          <w:rPr>
-            <w:rStyle w:val="Hyperlink"/>
-            <w:sz w:val="20"/>
-            <w:szCs w:val="20"/>
-          </w:rPr>
-          <w:t>https://github.com/RejuvenationCh/DS-Stack-Chris_Brilianto_Chandra-2086022510022/tree/main/Question1</w:t>
-        </w:r>
-      </w:hyperlink>
+      <w:r>
+        <w:rPr>
+          <w:sz w:val="20"/>
+          <w:szCs w:val="20"/>
+        </w:rPr>
+        <w:t xml:space="preserve">Visual Studio Code Built In IDE </w:t>
+      </w:r>
+      <w:r>
+        <w:rPr>
+          <w:sz w:val="20"/>
+          <w:szCs w:val="20"/>
+        </w:rPr>
+        <w:t>Autofill (</w:t>
+      </w:r>
+      <w:proofErr w:type="spellStart"/>
+      <w:proofErr w:type="gramStart"/>
+      <w:r>
+        <w:rPr>
+          <w:sz w:val="20"/>
+          <w:szCs w:val="20"/>
+        </w:rPr>
+        <w:t>bagian</w:t>
+      </w:r>
+      <w:proofErr w:type="spellEnd"/>
+      <w:r>
+        <w:rPr>
+          <w:sz w:val="20"/>
+          <w:szCs w:val="20"/>
+        </w:rPr>
+        <w:t xml:space="preserve"> </w:t>
+      </w:r>
+      <w:r>
+        <w:rPr>
+          <w:sz w:val="20"/>
+          <w:szCs w:val="20"/>
+        </w:rPr>
+        <w:t xml:space="preserve"> for</w:t>
+      </w:r>
+      <w:proofErr w:type="gramEnd"/>
+      <w:r>
+        <w:rPr>
+          <w:sz w:val="20"/>
+          <w:szCs w:val="20"/>
+        </w:rPr>
+        <w:t xml:space="preserve"> (char bracket : brackets)</w:t>
+      </w:r>
+      <w:r>
+        <w:rPr>
+          <w:sz w:val="20"/>
+          <w:szCs w:val="20"/>
+        </w:rPr>
+        <w:t>)</w:t>
+      </w:r>
     </w:p>
     <w:p>
       <w:pPr>
+        <w:pStyle w:val="ListParagraph"/>
+        <w:numPr>
+          <w:ilvl w:val="0"/>
+          <w:numId w:val="41"/>
+        </w:numPr>
         <w:jc w:val="both"/>
         <w:rPr>
           <w:sz w:val="20"/>
           <w:szCs w:val="20"/>
         </w:rPr>
       </w:pPr>
+      <w:r>
+        <w:rPr>
+          <w:sz w:val="20"/>
+          <w:szCs w:val="20"/>
+        </w:rPr>
+        <w:t>Elvina Angelica IMT Code</w:t>
+      </w:r>
     </w:p>
     <w:p>
       <w:pPr>
@@ -6172,21 +6241,7 @@
           <w:szCs w:val="20"/>
         </w:rPr>
         <w:lastRenderedPageBreak/>
-        <w:t>Question Number 1</w:t>
-      </w:r>
-      <w:r>
-        <w:rPr>
-          <w:sz w:val="20"/>
-          <w:szCs w:val="20"/>
-        </w:rPr>
-        <w:t>I</w:t>
-      </w:r>
-      <w:r>
-        <w:rPr>
-          <w:sz w:val="20"/>
-          <w:szCs w:val="20"/>
-        </w:rPr>
-        <w:t xml:space="preserve"> : </w:t>
+        <w:t xml:space="preserve">Question Number 1I : </w:t>
       </w:r>
       <w:r>
         <w:rPr>
@@ -11441,7 +11496,7 @@
                     <pic:cNvPicPr/>
                   </pic:nvPicPr>
                   <pic:blipFill>
-                    <a:blip r:embed="rId12">
+                    <a:blip r:embed="rId11">
                       <a:extLst>
                         <a:ext uri="{28A0092B-C50C-407E-A947-70E740481C1C}">
                           <a14:useLocalDpi xmlns:a14="http://schemas.microsoft.com/office/drawing/2010/main" val="0"/>
@@ -11549,7 +11604,7 @@
           <w:noProof/>
         </w:rPr>
         <w:drawing>
-          <wp:inline distT="0" distB="0" distL="0" distR="0" wp14:anchorId="51AA942D" wp14:editId="1A33CB10">
+          <wp:inline distT="0" distB="0" distL="0" distR="0" wp14:anchorId="51AA942D" wp14:editId="24F27596">
             <wp:extent cx="2050473" cy="385148"/>
             <wp:effectExtent l="0" t="0" r="0" b="0"/>
             <wp:docPr id="407581454" name="Picture 5"/>
@@ -11564,7 +11619,7 @@
                     <pic:cNvPicPr/>
                   </pic:nvPicPr>
                   <pic:blipFill>
-                    <a:blip r:embed="rId13" cstate="print">
+                    <a:blip r:embed="rId12" cstate="print">
                       <a:extLst>
                         <a:ext uri="{28A0092B-C50C-407E-A947-70E740481C1C}">
                           <a14:useLocalDpi xmlns:a14="http://schemas.microsoft.com/office/drawing/2010/main" val="0"/>
@@ -11684,7 +11739,7 @@
                     <pic:cNvPicPr/>
                   </pic:nvPicPr>
                   <pic:blipFill>
-                    <a:blip r:embed="rId14">
+                    <a:blip r:embed="rId13">
                       <a:extLst>
                         <a:ext uri="{28A0092B-C50C-407E-A947-70E740481C1C}">
                           <a14:useLocalDpi xmlns:a14="http://schemas.microsoft.com/office/drawing/2010/main" val="0"/>
@@ -11742,42 +11797,80 @@
     </w:p>
     <w:p>
       <w:pPr>
+        <w:pStyle w:val="ListParagraph"/>
+        <w:numPr>
+          <w:ilvl w:val="0"/>
+          <w:numId w:val="41"/>
+        </w:numPr>
         <w:jc w:val="both"/>
         <w:rPr>
           <w:sz w:val="20"/>
           <w:szCs w:val="20"/>
         </w:rPr>
       </w:pPr>
-      <w:hyperlink r:id="rId15" w:history="1">
-        <w:r>
-          <w:rPr>
-            <w:rStyle w:val="Hyperlink"/>
-            <w:sz w:val="20"/>
-            <w:szCs w:val="20"/>
-          </w:rPr>
-          <w:t>https://github.com/RejuvenationCh/DS-Stack-Chris_Brilianto_Chandra-2086022510022/tree/main/Question</w:t>
-        </w:r>
-        <w:r>
-          <w:rPr>
-            <w:rStyle w:val="Hyperlink"/>
-            <w:sz w:val="20"/>
-            <w:szCs w:val="20"/>
-          </w:rPr>
-          <w:t>2</w:t>
-        </w:r>
-      </w:hyperlink>
+      <w:r>
+        <w:rPr>
+          <w:sz w:val="20"/>
+          <w:szCs w:val="20"/>
+        </w:rPr>
+        <w:t xml:space="preserve">Visual Studio Code Built </w:t>
+      </w:r>
+      <w:proofErr w:type="gramStart"/>
+      <w:r>
+        <w:rPr>
+          <w:sz w:val="20"/>
+          <w:szCs w:val="20"/>
+        </w:rPr>
+        <w:t>In</w:t>
+      </w:r>
+      <w:proofErr w:type="gramEnd"/>
+      <w:r>
+        <w:rPr>
+          <w:sz w:val="20"/>
+          <w:szCs w:val="20"/>
+        </w:rPr>
+        <w:t xml:space="preserve"> IDE </w:t>
+      </w:r>
+      <w:r>
+        <w:rPr>
+          <w:sz w:val="20"/>
+          <w:szCs w:val="20"/>
+        </w:rPr>
+        <w:t xml:space="preserve">Autofill </w:t>
+      </w:r>
     </w:p>
     <w:p>
       <w:pPr>
+        <w:pStyle w:val="ListParagraph"/>
+        <w:numPr>
+          <w:ilvl w:val="0"/>
+          <w:numId w:val="41"/>
+        </w:numPr>
         <w:jc w:val="both"/>
         <w:rPr>
           <w:sz w:val="20"/>
           <w:szCs w:val="20"/>
         </w:rPr>
       </w:pPr>
+      <w:r>
+        <w:rPr>
+          <w:sz w:val="20"/>
+          <w:szCs w:val="20"/>
+        </w:rPr>
+        <w:t>Gemini 3.1 Pro – Integer Parsing &amp; Regex</w:t>
+      </w:r>
     </w:p>
     <w:p>
       <w:pPr>
+        <w:jc w:val="both"/>
+        <w:rPr>
+          <w:sz w:val="20"/>
+          <w:szCs w:val="20"/>
+        </w:rPr>
+      </w:pPr>
+    </w:p>
+    <w:p>
+      <w:pPr>
         <w:ind w:firstLine="288"/>
         <w:jc w:val="both"/>
         <w:rPr>
@@ -12024,21 +12117,7 @@
           <w:sz w:val="20"/>
           <w:szCs w:val="20"/>
         </w:rPr>
-        <w:t>I</w:t>
-      </w:r>
-      <w:r>
-        <w:rPr>
-          <w:sz w:val="20"/>
-          <w:szCs w:val="20"/>
-        </w:rPr>
-        <w:t>I</w:t>
-      </w:r>
-      <w:r>
-        <w:rPr>
-          <w:sz w:val="20"/>
-          <w:szCs w:val="20"/>
-        </w:rPr>
-        <w:t xml:space="preserve"> : </w:t>
+        <w:t xml:space="preserve">II : </w:t>
       </w:r>
       <w:r>
         <w:rPr>
@@ -16900,7 +16979,7 @@
                     <pic:cNvPicPr/>
                   </pic:nvPicPr>
                   <pic:blipFill>
-                    <a:blip r:embed="rId16">
+                    <a:blip r:embed="rId14">
                       <a:extLst>
                         <a:ext uri="{28A0092B-C50C-407E-A947-70E740481C1C}">
                           <a14:useLocalDpi xmlns:a14="http://schemas.microsoft.com/office/drawing/2010/main" val="0"/>
@@ -17010,7 +17089,7 @@
           <w:noProof/>
         </w:rPr>
         <w:drawing>
-          <wp:inline distT="0" distB="0" distL="0" distR="0" wp14:anchorId="19A56C0E" wp14:editId="6829517D">
+          <wp:inline distT="0" distB="0" distL="0" distR="0" wp14:anchorId="19A56C0E" wp14:editId="6CB98A10">
             <wp:extent cx="3089910" cy="237490"/>
             <wp:effectExtent l="0" t="0" r="0" b="3810"/>
             <wp:docPr id="914060908" name="Picture 8"/>
@@ -17025,7 +17104,7 @@
                     <pic:cNvPicPr/>
                   </pic:nvPicPr>
                   <pic:blipFill>
-                    <a:blip r:embed="rId17" cstate="print">
+                    <a:blip r:embed="rId15" cstate="print">
                       <a:extLst>
                         <a:ext uri="{28A0092B-C50C-407E-A947-70E740481C1C}">
                           <a14:useLocalDpi xmlns:a14="http://schemas.microsoft.com/office/drawing/2010/main" val="0"/>
@@ -17277,48 +17356,75 @@
     </w:p>
     <w:p>
       <w:pPr>
+        <w:pStyle w:val="ListParagraph"/>
+        <w:numPr>
+          <w:ilvl w:val="0"/>
+          <w:numId w:val="41"/>
+        </w:numPr>
         <w:jc w:val="both"/>
         <w:rPr>
           <w:sz w:val="20"/>
           <w:szCs w:val="20"/>
         </w:rPr>
       </w:pPr>
-      <w:hyperlink r:id="rId18" w:history="1">
-        <w:r>
-          <w:rPr>
-            <w:rStyle w:val="Hyperlink"/>
-            <w:sz w:val="20"/>
-            <w:szCs w:val="20"/>
-          </w:rPr>
-          <w:t>https://github.com/RejuvenationCh/DS-Stack-Chris_Brilianto_Chandra-2086022510022/tree/main/Question</w:t>
-        </w:r>
-        <w:r>
-          <w:rPr>
-            <w:rStyle w:val="Hyperlink"/>
-            <w:sz w:val="20"/>
-            <w:szCs w:val="20"/>
-          </w:rPr>
-          <w:t>3</w:t>
-        </w:r>
-      </w:hyperlink>
+      <w:r>
+        <w:rPr>
+          <w:sz w:val="20"/>
+          <w:szCs w:val="20"/>
+        </w:rPr>
+        <w:t xml:space="preserve">Visual Studio Code Built </w:t>
+      </w:r>
+      <w:proofErr w:type="gramStart"/>
+      <w:r>
+        <w:rPr>
+          <w:sz w:val="20"/>
+          <w:szCs w:val="20"/>
+        </w:rPr>
+        <w:t>In</w:t>
+      </w:r>
+      <w:proofErr w:type="gramEnd"/>
+      <w:r>
+        <w:rPr>
+          <w:sz w:val="20"/>
+          <w:szCs w:val="20"/>
+        </w:rPr>
+        <w:t xml:space="preserve"> IDE </w:t>
+      </w:r>
+      <w:r>
+        <w:rPr>
+          <w:sz w:val="20"/>
+          <w:szCs w:val="20"/>
+        </w:rPr>
+        <w:t xml:space="preserve">Autofill </w:t>
+      </w:r>
     </w:p>
     <w:p>
       <w:pPr>
+        <w:pStyle w:val="ListParagraph"/>
+        <w:numPr>
+          <w:ilvl w:val="0"/>
+          <w:numId w:val="41"/>
+        </w:numPr>
         <w:jc w:val="both"/>
         <w:rPr>
           <w:sz w:val="20"/>
           <w:szCs w:val="20"/>
         </w:rPr>
       </w:pPr>
-    </w:p>
-    <w:p>
-      <w:pPr>
-        <w:jc w:val="both"/>
-        <w:rPr>
-          <w:sz w:val="20"/>
-          <w:szCs w:val="20"/>
-        </w:rPr>
-      </w:pPr>
+      <w:r>
+        <w:rPr>
+          <w:sz w:val="20"/>
+          <w:szCs w:val="20"/>
+        </w:rPr>
+        <w:t xml:space="preserve">Gemini 3.1 Pro – </w:t>
+      </w:r>
+      <w:r>
+        <w:rPr>
+          <w:sz w:val="20"/>
+          <w:szCs w:val="20"/>
+        </w:rPr>
+        <w:t xml:space="preserve">Logic &amp; Instructions </w:t>
+      </w:r>
     </w:p>
     <w:p>
       <w:pPr>
@@ -17900,15 +18006,31 @@
           <w:sz w:val="20"/>
           <w:szCs w:val="20"/>
         </w:rPr>
-        <w:t>terkecil ke yan</w:t>
-      </w:r>
-      <w:proofErr w:type="spellEnd"/>
-      <w:r>
-        <w:rPr>
-          <w:sz w:val="20"/>
-          <w:szCs w:val="20"/>
-        </w:rPr>
-        <w:t xml:space="preserve">g </w:t>
+        <w:t>terkecil</w:t>
+      </w:r>
+      <w:proofErr w:type="spellEnd"/>
+      <w:r>
+        <w:rPr>
+          <w:sz w:val="20"/>
+          <w:szCs w:val="20"/>
+        </w:rPr>
+        <w:t xml:space="preserve"> </w:t>
+      </w:r>
+      <w:proofErr w:type="spellStart"/>
+      <w:r>
+        <w:rPr>
+          <w:sz w:val="20"/>
+          <w:szCs w:val="20"/>
+        </w:rPr>
+        <w:t>ke</w:t>
+      </w:r>
+      <w:proofErr w:type="spellEnd"/>
+      <w:r>
+        <w:rPr>
+          <w:sz w:val="20"/>
+          <w:szCs w:val="20"/>
+        </w:rPr>
+        <w:t xml:space="preserve"> yang </w:t>
       </w:r>
       <w:proofErr w:type="spellStart"/>
       <w:r>
@@ -21861,7 +21983,6 @@
         </w:rPr>
         <w:t>ime &amp; Space Complexity</w:t>
       </w:r>
-      <w:proofErr w:type="spellStart"/>
     </w:p>
     <w:p>
       <w:pPr>
@@ -21872,20 +21993,21 @@
           <w:szCs w:val="20"/>
         </w:rPr>
       </w:pPr>
-      <w:r>
-        <w:rPr>
-          <w:sz w:val="20"/>
-          <w:szCs w:val="20"/>
-        </w:rPr>
-        <w:t xml:space="preserve">Secara </w:t>
-      </w:r>
-      <w:proofErr w:type="spellEnd"/>
-      <w:r>
-        <w:rPr>
-          <w:sz w:val="20"/>
-          <w:szCs w:val="20"/>
-        </w:rPr>
-        <w:t xml:space="preserve">complexity, </w:t>
+      <w:proofErr w:type="spellStart"/>
+      <w:r>
+        <w:rPr>
+          <w:sz w:val="20"/>
+          <w:szCs w:val="20"/>
+        </w:rPr>
+        <w:t>Secara</w:t>
+      </w:r>
+      <w:proofErr w:type="spellEnd"/>
+      <w:r>
+        <w:rPr>
+          <w:sz w:val="20"/>
+          <w:szCs w:val="20"/>
+        </w:rPr>
+        <w:t xml:space="preserve"> complexity, </w:t>
       </w:r>
       <w:proofErr w:type="spellStart"/>
       <w:r>
@@ -22525,7 +22647,7 @@
                     <pic:cNvPicPr/>
                   </pic:nvPicPr>
                   <pic:blipFill>
-                    <a:blip r:embed="rId19">
+                    <a:blip r:embed="rId16">
                       <a:extLst>
                         <a:ext uri="{28A0092B-C50C-407E-A947-70E740481C1C}">
                           <a14:useLocalDpi xmlns:a14="http://schemas.microsoft.com/office/drawing/2010/main" val="0"/>
@@ -22652,7 +22774,7 @@
                     <pic:cNvPicPr/>
                   </pic:nvPicPr>
                   <pic:blipFill>
-                    <a:blip r:embed="rId20">
+                    <a:blip r:embed="rId17">
                       <a:extLst>
                         <a:ext uri="{28A0092B-C50C-407E-A947-70E740481C1C}">
                           <a14:useLocalDpi xmlns:a14="http://schemas.microsoft.com/office/drawing/2010/main" val="0"/>
@@ -22711,22 +22833,54 @@
     </w:p>
     <w:p>
       <w:pPr>
+        <w:pStyle w:val="ListParagraph"/>
+        <w:numPr>
+          <w:ilvl w:val="0"/>
+          <w:numId w:val="41"/>
+        </w:numPr>
         <w:jc w:val="both"/>
         <w:rPr>
           <w:sz w:val="20"/>
           <w:szCs w:val="20"/>
         </w:rPr>
       </w:pPr>
-      <w:hyperlink r:id="rId21" w:history="1">
-        <w:r>
-          <w:rPr>
-            <w:rStyle w:val="Hyperlink"/>
-            <w:sz w:val="20"/>
-            <w:szCs w:val="20"/>
-          </w:rPr>
-          <w:t>https://github.com/RejuvenationCh/DS-Stack-Chris_Brilianto_Chandra-2086022510022/tree/main/Question4</w:t>
-        </w:r>
-      </w:hyperlink>
+      <w:r>
+        <w:rPr>
+          <w:sz w:val="20"/>
+          <w:szCs w:val="20"/>
+        </w:rPr>
+        <w:t xml:space="preserve">Visual Studio Code Built </w:t>
+      </w:r>
+      <w:proofErr w:type="gramStart"/>
+      <w:r>
+        <w:rPr>
+          <w:sz w:val="20"/>
+          <w:szCs w:val="20"/>
+        </w:rPr>
+        <w:t>In</w:t>
+      </w:r>
+      <w:proofErr w:type="gramEnd"/>
+      <w:r>
+        <w:rPr>
+          <w:sz w:val="20"/>
+          <w:szCs w:val="20"/>
+        </w:rPr>
+        <w:t xml:space="preserve"> IDE </w:t>
+      </w:r>
+      <w:r>
+        <w:rPr>
+          <w:sz w:val="20"/>
+          <w:szCs w:val="20"/>
+        </w:rPr>
+        <w:t xml:space="preserve">Autofill </w:t>
+      </w:r>
+      <w:r>
+        <w:rPr>
+          <w:sz w:val="20"/>
+          <w:szCs w:val="20"/>
+        </w:rPr>
+        <w:t>– Printing Sorted Stack</w:t>
+      </w:r>
     </w:p>
     <w:p>
       <w:pPr>
@@ -22738,14 +22892,6 @@
           <w:lang w:val="en-US"/>
         </w:rPr>
       </w:pPr>
-      <w:r>
-        <w:rPr>
-          <w:sz w:val="20"/>
-          <w:szCs w:val="20"/>
-          <w:lang w:val="en-US"/>
-        </w:rPr>
-        <w:tab/>
-      </w:r>
     </w:p>
     <w:p>
       <w:pPr>
@@ -27403,7 +27549,7 @@
                     <pic:cNvPicPr/>
                   </pic:nvPicPr>
                   <pic:blipFill>
-                    <a:blip r:embed="rId22">
+                    <a:blip r:embed="rId18">
                       <a:extLst>
                         <a:ext uri="{28A0092B-C50C-407E-A947-70E740481C1C}">
                           <a14:useLocalDpi xmlns:a14="http://schemas.microsoft.com/office/drawing/2010/main" val="0"/>
@@ -27523,7 +27669,7 @@
                     <pic:cNvPicPr/>
                   </pic:nvPicPr>
                   <pic:blipFill>
-                    <a:blip r:embed="rId23" cstate="print">
+                    <a:blip r:embed="rId19" cstate="print">
                       <a:extLst>
                         <a:ext uri="{28A0092B-C50C-407E-A947-70E740481C1C}">
                           <a14:useLocalDpi xmlns:a14="http://schemas.microsoft.com/office/drawing/2010/main" val="0"/>
@@ -27579,41 +27725,6 @@
         </w:rPr>
         <w:t>Code Reference</w:t>
       </w:r>
-    </w:p>
-    <w:p>
-      <w:pPr>
-        <w:jc w:val="both"/>
-        <w:rPr>
-          <w:sz w:val="20"/>
-          <w:szCs w:val="20"/>
-        </w:rPr>
-      </w:pPr>
-      <w:hyperlink r:id="rId24" w:history="1">
-        <w:r>
-          <w:rPr>
-            <w:rStyle w:val="Hyperlink"/>
-            <w:sz w:val="20"/>
-            <w:szCs w:val="20"/>
-          </w:rPr>
-          <w:t>https://github.com/Rejuvenatio</w:t>
-        </w:r>
-        <w:r>
-          <w:rPr>
-            <w:rStyle w:val="Hyperlink"/>
-            <w:sz w:val="20"/>
-            <w:szCs w:val="20"/>
-          </w:rPr>
-          <w:t>n</w:t>
-        </w:r>
-        <w:r>
-          <w:rPr>
-            <w:rStyle w:val="Hyperlink"/>
-            <w:sz w:val="20"/>
-            <w:szCs w:val="20"/>
-          </w:rPr>
-          <w:t>Ch/DS-Stack-Chris_Brilianto_Chandra-2086022510022/tree/main/Question5</w:t>
-        </w:r>
-      </w:hyperlink>
     </w:p>
     <w:p>
       <w:pPr>
@@ -28563,6 +28674,118 @@
     </w:lvl>
   </w:abstractNum>
   <w:abstractNum w:abstractNumId="16" w15:restartNumberingAfterBreak="0">
+    <w:nsid w:val="177817C1"/>
+    <w:multiLevelType w:val="hybridMultilevel"/>
+    <w:tmpl w:val="63B46876"/>
+    <w:lvl w:ilvl="0" w:tplc="EF7AE046">
+      <w:numFmt w:val="bullet"/>
+      <w:lvlText w:val="-"/>
+      <w:lvlJc w:val="left"/>
+      <w:pPr>
+        <w:ind w:left="720" w:hanging="360"/>
+      </w:pPr>
+      <w:rPr>
+        <w:rFonts w:ascii="Times New Roman" w:eastAsia="Times New Roman" w:hAnsi="Times New Roman" w:cs="Times New Roman" w:hint="default"/>
+      </w:rPr>
+    </w:lvl>
+    <w:lvl w:ilvl="1" w:tplc="08090003" w:tentative="1">
+      <w:start w:val="1"/>
+      <w:numFmt w:val="bullet"/>
+      <w:lvlText w:val="o"/>
+      <w:lvlJc w:val="left"/>
+      <w:pPr>
+        <w:ind w:left="1440" w:hanging="360"/>
+      </w:pPr>
+      <w:rPr>
+        <w:rFonts w:ascii="Courier New" w:hAnsi="Courier New" w:cs="Courier New" w:hint="default"/>
+      </w:rPr>
+    </w:lvl>
+    <w:lvl w:ilvl="2" w:tplc="08090005" w:tentative="1">
+      <w:start w:val="1"/>
+      <w:numFmt w:val="bullet"/>
+      <w:lvlText w:val=""/>
+      <w:lvlJc w:val="left"/>
+      <w:pPr>
+        <w:ind w:left="2160" w:hanging="360"/>
+      </w:pPr>
+      <w:rPr>
+        <w:rFonts w:ascii="Wingdings" w:hAnsi="Wingdings" w:hint="default"/>
+      </w:rPr>
+    </w:lvl>
+    <w:lvl w:ilvl="3" w:tplc="08090001" w:tentative="1">
+      <w:start w:val="1"/>
+      <w:numFmt w:val="bullet"/>
+      <w:lvlText w:val=""/>
+      <w:lvlJc w:val="left"/>
+      <w:pPr>
+        <w:ind w:left="2880" w:hanging="360"/>
+      </w:pPr>
+      <w:rPr>
+        <w:rFonts w:ascii="Symbol" w:hAnsi="Symbol" w:hint="default"/>
+      </w:rPr>
+    </w:lvl>
+    <w:lvl w:ilvl="4" w:tplc="08090003" w:tentative="1">
+      <w:start w:val="1"/>
+      <w:numFmt w:val="bullet"/>
+      <w:lvlText w:val="o"/>
+      <w:lvlJc w:val="left"/>
+      <w:pPr>
+        <w:ind w:left="3600" w:hanging="360"/>
+      </w:pPr>
+      <w:rPr>
+        <w:rFonts w:ascii="Courier New" w:hAnsi="Courier New" w:cs="Courier New" w:hint="default"/>
+      </w:rPr>
+    </w:lvl>
+    <w:lvl w:ilvl="5" w:tplc="08090005" w:tentative="1">
+      <w:start w:val="1"/>
+      <w:numFmt w:val="bullet"/>
+      <w:lvlText w:val=""/>
+      <w:lvlJc w:val="left"/>
+      <w:pPr>
+        <w:ind w:left="4320" w:hanging="360"/>
+      </w:pPr>
+      <w:rPr>
+        <w:rFonts w:ascii="Wingdings" w:hAnsi="Wingdings" w:hint="default"/>
+      </w:rPr>
+    </w:lvl>
+    <w:lvl w:ilvl="6" w:tplc="08090001" w:tentative="1">
+      <w:start w:val="1"/>
+      <w:numFmt w:val="bullet"/>
+      <w:lvlText w:val=""/>
+      <w:lvlJc w:val="left"/>
+      <w:pPr>
+        <w:ind w:left="5040" w:hanging="360"/>
+      </w:pPr>
+      <w:rPr>
+        <w:rFonts w:ascii="Symbol" w:hAnsi="Symbol" w:hint="default"/>
+      </w:rPr>
+    </w:lvl>
+    <w:lvl w:ilvl="7" w:tplc="08090003" w:tentative="1">
+      <w:start w:val="1"/>
+      <w:numFmt w:val="bullet"/>
+      <w:lvlText w:val="o"/>
+      <w:lvlJc w:val="left"/>
+      <w:pPr>
+        <w:ind w:left="5760" w:hanging="360"/>
+      </w:pPr>
+      <w:rPr>
+        <w:rFonts w:ascii="Courier New" w:hAnsi="Courier New" w:cs="Courier New" w:hint="default"/>
+      </w:rPr>
+    </w:lvl>
+    <w:lvl w:ilvl="8" w:tplc="08090005" w:tentative="1">
+      <w:start w:val="1"/>
+      <w:numFmt w:val="bullet"/>
+      <w:lvlText w:val=""/>
+      <w:lvlJc w:val="left"/>
+      <w:pPr>
+        <w:ind w:left="6480" w:hanging="360"/>
+      </w:pPr>
+      <w:rPr>
+        <w:rFonts w:ascii="Wingdings" w:hAnsi="Wingdings" w:hint="default"/>
+      </w:rPr>
+    </w:lvl>
+  </w:abstractNum>
+  <w:abstractNum w:abstractNumId="17" w15:restartNumberingAfterBreak="0">
     <w:nsid w:val="18F40C22"/>
     <w:multiLevelType w:val="hybridMultilevel"/>
     <w:tmpl w:val="2E864630"/>
@@ -28675,7 +28898,7 @@
       </w:rPr>
     </w:lvl>
   </w:abstractNum>
-  <w:abstractNum w:abstractNumId="17" w15:restartNumberingAfterBreak="0">
+  <w:abstractNum w:abstractNumId="18" w15:restartNumberingAfterBreak="0">
     <w:nsid w:val="1D502F1C"/>
     <w:multiLevelType w:val="hybridMultilevel"/>
     <w:tmpl w:val="B8FE7E06"/>
@@ -28764,7 +28987,7 @@
       </w:pPr>
     </w:lvl>
   </w:abstractNum>
-  <w:abstractNum w:abstractNumId="18" w15:restartNumberingAfterBreak="0">
+  <w:abstractNum w:abstractNumId="19" w15:restartNumberingAfterBreak="0">
     <w:nsid w:val="1E177E97"/>
     <w:multiLevelType w:val="hybridMultilevel"/>
     <w:tmpl w:val="A6463BCE"/>
@@ -28850,7 +29073,7 @@
       </w:pPr>
     </w:lvl>
   </w:abstractNum>
-  <w:abstractNum w:abstractNumId="19" w15:restartNumberingAfterBreak="0">
+  <w:abstractNum w:abstractNumId="20" w15:restartNumberingAfterBreak="0">
     <w:nsid w:val="1F8D2BA7"/>
     <w:multiLevelType w:val="hybridMultilevel"/>
     <w:tmpl w:val="EA8225EC"/>
@@ -28939,7 +29162,7 @@
       </w:pPr>
     </w:lvl>
   </w:abstractNum>
-  <w:abstractNum w:abstractNumId="20" w15:restartNumberingAfterBreak="0">
+  <w:abstractNum w:abstractNumId="21" w15:restartNumberingAfterBreak="0">
     <w:nsid w:val="1FD8676C"/>
     <w:multiLevelType w:val="hybridMultilevel"/>
     <w:tmpl w:val="B8FE7E06"/>
@@ -29028,7 +29251,7 @@
       </w:pPr>
     </w:lvl>
   </w:abstractNum>
-  <w:abstractNum w:abstractNumId="21" w15:restartNumberingAfterBreak="0">
+  <w:abstractNum w:abstractNumId="22" w15:restartNumberingAfterBreak="0">
     <w:nsid w:val="20AF0333"/>
     <w:multiLevelType w:val="hybridMultilevel"/>
     <w:tmpl w:val="CB0E7F4E"/>
@@ -29170,7 +29393,7 @@
       </w:rPr>
     </w:lvl>
   </w:abstractNum>
-  <w:abstractNum w:abstractNumId="22" w15:restartNumberingAfterBreak="0">
+  <w:abstractNum w:abstractNumId="23" w15:restartNumberingAfterBreak="0">
     <w:nsid w:val="22073085"/>
     <w:multiLevelType w:val="hybridMultilevel"/>
     <w:tmpl w:val="9CA6F640"/>
@@ -29259,7 +29482,7 @@
       </w:pPr>
     </w:lvl>
   </w:abstractNum>
-  <w:abstractNum w:abstractNumId="23" w15:restartNumberingAfterBreak="0">
+  <w:abstractNum w:abstractNumId="24" w15:restartNumberingAfterBreak="0">
     <w:nsid w:val="23110CF3"/>
     <w:multiLevelType w:val="hybridMultilevel"/>
     <w:tmpl w:val="23889982"/>
@@ -29348,7 +29571,7 @@
       </w:pPr>
     </w:lvl>
   </w:abstractNum>
-  <w:abstractNum w:abstractNumId="24" w15:restartNumberingAfterBreak="0">
+  <w:abstractNum w:abstractNumId="25" w15:restartNumberingAfterBreak="0">
     <w:nsid w:val="26FE1FCF"/>
     <w:multiLevelType w:val="hybridMultilevel"/>
     <w:tmpl w:val="33826962"/>
@@ -29509,7 +29732,7 @@
       </w:rPr>
     </w:lvl>
   </w:abstractNum>
-  <w:abstractNum w:abstractNumId="25" w15:restartNumberingAfterBreak="0">
+  <w:abstractNum w:abstractNumId="26" w15:restartNumberingAfterBreak="0">
     <w:nsid w:val="3355748A"/>
     <w:multiLevelType w:val="hybridMultilevel"/>
     <w:tmpl w:val="30489120"/>
@@ -29598,7 +29821,7 @@
       </w:pPr>
     </w:lvl>
   </w:abstractNum>
-  <w:abstractNum w:abstractNumId="26" w15:restartNumberingAfterBreak="0">
+  <w:abstractNum w:abstractNumId="27" w15:restartNumberingAfterBreak="0">
     <w:nsid w:val="37660336"/>
     <w:multiLevelType w:val="hybridMultilevel"/>
     <w:tmpl w:val="754EAC84"/>
@@ -29739,7 +29962,7 @@
       </w:rPr>
     </w:lvl>
   </w:abstractNum>
-  <w:abstractNum w:abstractNumId="27" w15:restartNumberingAfterBreak="0">
+  <w:abstractNum w:abstractNumId="28" w15:restartNumberingAfterBreak="0">
     <w:nsid w:val="39E54FC6"/>
     <w:multiLevelType w:val="singleLevel"/>
     <w:tmpl w:val="5B7288D4"/>
@@ -29759,7 +29982,7 @@
       </w:rPr>
     </w:lvl>
   </w:abstractNum>
-  <w:abstractNum w:abstractNumId="28" w15:restartNumberingAfterBreak="0">
+  <w:abstractNum w:abstractNumId="29" w15:restartNumberingAfterBreak="0">
     <w:nsid w:val="4189603E"/>
     <w:multiLevelType w:val="multilevel"/>
     <w:tmpl w:val="0AB06E12"/>
@@ -29966,7 +30189,7 @@
       </w:rPr>
     </w:lvl>
   </w:abstractNum>
-  <w:abstractNum w:abstractNumId="29" w15:restartNumberingAfterBreak="0">
+  <w:abstractNum w:abstractNumId="30" w15:restartNumberingAfterBreak="0">
     <w:nsid w:val="493C3F76"/>
     <w:multiLevelType w:val="hybridMultilevel"/>
     <w:tmpl w:val="9A9E418C"/>
@@ -30077,7 +30300,7 @@
       </w:pPr>
     </w:lvl>
   </w:abstractNum>
-  <w:abstractNum w:abstractNumId="30" w15:restartNumberingAfterBreak="0">
+  <w:abstractNum w:abstractNumId="31" w15:restartNumberingAfterBreak="0">
     <w:nsid w:val="52CA544A"/>
     <w:multiLevelType w:val="singleLevel"/>
     <w:tmpl w:val="AED6D67E"/>
@@ -30104,7 +30327,7 @@
       </w:rPr>
     </w:lvl>
   </w:abstractNum>
-  <w:abstractNum w:abstractNumId="31" w15:restartNumberingAfterBreak="0">
+  <w:abstractNum w:abstractNumId="32" w15:restartNumberingAfterBreak="0">
     <w:nsid w:val="5DFA7BFF"/>
     <w:multiLevelType w:val="hybridMultilevel"/>
     <w:tmpl w:val="0F74116E"/>
@@ -30193,7 +30416,7 @@
       </w:pPr>
     </w:lvl>
   </w:abstractNum>
-  <w:abstractNum w:abstractNumId="32" w15:restartNumberingAfterBreak="0">
+  <w:abstractNum w:abstractNumId="33" w15:restartNumberingAfterBreak="0">
     <w:nsid w:val="62133E22"/>
     <w:multiLevelType w:val="hybridMultilevel"/>
     <w:tmpl w:val="CB261FE6"/>
@@ -30282,7 +30505,7 @@
       </w:pPr>
     </w:lvl>
   </w:abstractNum>
-  <w:abstractNum w:abstractNumId="33" w15:restartNumberingAfterBreak="0">
+  <w:abstractNum w:abstractNumId="34" w15:restartNumberingAfterBreak="0">
     <w:nsid w:val="6C402C58"/>
     <w:multiLevelType w:val="hybridMultilevel"/>
     <w:tmpl w:val="9A1CA078"/>
@@ -30427,7 +30650,7 @@
       </w:rPr>
     </w:lvl>
   </w:abstractNum>
-  <w:abstractNum w:abstractNumId="34" w15:restartNumberingAfterBreak="0">
+  <w:abstractNum w:abstractNumId="35" w15:restartNumberingAfterBreak="0">
     <w:nsid w:val="6CD32DA8"/>
     <w:multiLevelType w:val="singleLevel"/>
     <w:tmpl w:val="166470C2"/>
@@ -30453,7 +30676,7 @@
       </w:rPr>
     </w:lvl>
   </w:abstractNum>
-  <w:abstractNum w:abstractNumId="35" w15:restartNumberingAfterBreak="0">
+  <w:abstractNum w:abstractNumId="36" w15:restartNumberingAfterBreak="0">
     <w:nsid w:val="75EC31EF"/>
     <w:multiLevelType w:val="hybridMultilevel"/>
     <w:tmpl w:val="23889982"/>
@@ -30542,7 +30765,7 @@
       </w:pPr>
     </w:lvl>
   </w:abstractNum>
-  <w:abstractNum w:abstractNumId="36" w15:restartNumberingAfterBreak="0">
+  <w:abstractNum w:abstractNumId="37" w15:restartNumberingAfterBreak="0">
     <w:nsid w:val="7E351935"/>
     <w:multiLevelType w:val="hybridMultilevel"/>
     <w:tmpl w:val="16529E58"/>
@@ -30632,40 +30855,40 @@
     </w:lvl>
   </w:abstractNum>
   <w:num w:numId="1" w16cid:durableId="452021683">
-    <w:abstractNumId w:val="26"/>
+    <w:abstractNumId w:val="27"/>
   </w:num>
   <w:num w:numId="2" w16cid:durableId="369767128">
-    <w:abstractNumId w:val="33"/>
+    <w:abstractNumId w:val="34"/>
   </w:num>
   <w:num w:numId="3" w16cid:durableId="1493717388">
-    <w:abstractNumId w:val="24"/>
+    <w:abstractNumId w:val="25"/>
   </w:num>
   <w:num w:numId="4" w16cid:durableId="519785085">
+    <w:abstractNumId w:val="29"/>
+  </w:num>
+  <w:num w:numId="5" w16cid:durableId="1587155510">
+    <w:abstractNumId w:val="29"/>
+  </w:num>
+  <w:num w:numId="6" w16cid:durableId="1253008154">
+    <w:abstractNumId w:val="29"/>
+  </w:num>
+  <w:num w:numId="7" w16cid:durableId="897010153">
+    <w:abstractNumId w:val="29"/>
+  </w:num>
+  <w:num w:numId="8" w16cid:durableId="784353845">
+    <w:abstractNumId w:val="31"/>
+  </w:num>
+  <w:num w:numId="9" w16cid:durableId="178203959">
+    <w:abstractNumId w:val="35"/>
+  </w:num>
+  <w:num w:numId="10" w16cid:durableId="1302687958">
     <w:abstractNumId w:val="28"/>
   </w:num>
-  <w:num w:numId="5" w16cid:durableId="1587155510">
-    <w:abstractNumId w:val="28"/>
-  </w:num>
-  <w:num w:numId="6" w16cid:durableId="1253008154">
-    <w:abstractNumId w:val="28"/>
-  </w:num>
-  <w:num w:numId="7" w16cid:durableId="897010153">
-    <w:abstractNumId w:val="28"/>
-  </w:num>
-  <w:num w:numId="8" w16cid:durableId="784353845">
-    <w:abstractNumId w:val="30"/>
-  </w:num>
-  <w:num w:numId="9" w16cid:durableId="178203959">
-    <w:abstractNumId w:val="34"/>
-  </w:num>
-  <w:num w:numId="10" w16cid:durableId="1302687958">
-    <w:abstractNumId w:val="27"/>
-  </w:num>
   <w:num w:numId="11" w16cid:durableId="605844837">
-    <w:abstractNumId w:val="21"/>
+    <w:abstractNumId w:val="22"/>
   </w:num>
   <w:num w:numId="12" w16cid:durableId="85619789">
-    <w:abstractNumId w:val="18"/>
+    <w:abstractNumId w:val="19"/>
   </w:num>
   <w:num w:numId="13" w16cid:durableId="71853518">
     <w:abstractNumId w:val="0"/>
@@ -30701,43 +30924,43 @@
     <w:abstractNumId w:val="1"/>
   </w:num>
   <w:num w:numId="24" w16cid:durableId="1845166820">
-    <w:abstractNumId w:val="29"/>
+    <w:abstractNumId w:val="30"/>
   </w:num>
   <w:num w:numId="25" w16cid:durableId="1005740662">
-    <w:abstractNumId w:val="16"/>
+    <w:abstractNumId w:val="17"/>
   </w:num>
   <w:num w:numId="26" w16cid:durableId="98452318">
-    <w:abstractNumId w:val="19"/>
+    <w:abstractNumId w:val="20"/>
   </w:num>
   <w:num w:numId="27" w16cid:durableId="228271266">
-    <w:abstractNumId w:val="17"/>
+    <w:abstractNumId w:val="18"/>
   </w:num>
   <w:num w:numId="28" w16cid:durableId="1662730777">
-    <w:abstractNumId w:val="20"/>
+    <w:abstractNumId w:val="21"/>
   </w:num>
   <w:num w:numId="29" w16cid:durableId="454718680">
-    <w:abstractNumId w:val="22"/>
+    <w:abstractNumId w:val="23"/>
   </w:num>
   <w:num w:numId="30" w16cid:durableId="981081526">
-    <w:abstractNumId w:val="23"/>
+    <w:abstractNumId w:val="24"/>
   </w:num>
   <w:num w:numId="31" w16cid:durableId="1270089130">
-    <w:abstractNumId w:val="35"/>
+    <w:abstractNumId w:val="36"/>
   </w:num>
   <w:num w:numId="32" w16cid:durableId="1987664825">
     <w:abstractNumId w:val="14"/>
   </w:num>
   <w:num w:numId="33" w16cid:durableId="1698501843">
-    <w:abstractNumId w:val="36"/>
+    <w:abstractNumId w:val="37"/>
   </w:num>
   <w:num w:numId="34" w16cid:durableId="817692794">
     <w:abstractNumId w:val="11"/>
   </w:num>
   <w:num w:numId="35" w16cid:durableId="1038362318">
-    <w:abstractNumId w:val="32"/>
+    <w:abstractNumId w:val="33"/>
   </w:num>
   <w:num w:numId="36" w16cid:durableId="1018386210">
-    <w:abstractNumId w:val="31"/>
+    <w:abstractNumId w:val="32"/>
   </w:num>
   <w:num w:numId="37" w16cid:durableId="918488309">
     <w:abstractNumId w:val="13"/>
@@ -30746,10 +30969,13 @@
     <w:abstractNumId w:val="12"/>
   </w:num>
   <w:num w:numId="39" w16cid:durableId="2058776687">
-    <w:abstractNumId w:val="25"/>
+    <w:abstractNumId w:val="26"/>
   </w:num>
   <w:num w:numId="40" w16cid:durableId="1196312021">
     <w:abstractNumId w:val="15"/>
+  </w:num>
+  <w:num w:numId="41" w16cid:durableId="936593725">
+    <w:abstractNumId w:val="16"/>
   </w:num>
 </w:numbering>
 </file>
@@ -31051,7 +31277,7 @@
   <w:style w:type="paragraph" w:default="1" w:styleId="Normal">
     <w:name w:val="Normal"/>
     <w:qFormat/>
-    <w:rsid w:val="009D594C"/>
+    <w:rsid w:val="00713427"/>
     <w:rPr>
       <w:rFonts w:eastAsia="Times New Roman"/>
       <w:sz w:val="24"/>

</xml_diff>